<commit_message>
Replace scraper with NLP and Titanic projects
</commit_message>
<xml_diff>
--- a/assets/Yash_Bansal_ATS_Data_Analyst_Resume.docx
+++ b/assets/Yash_Bansal_ATS_Data_Analyst_Resume.docx
@@ -40,7 +40,7 @@
           <w:rFonts w:ascii="Arial" w:hAnsi="Arial"/>
           <w:sz w:val="17"/>
         </w:rPr>
-        <w:t>Entry-level Data Analyst and BCA Data Science student skilled in Python, SQL, Excel, Power BI, machine learning, dashboarding, data cleaning, and business insight generation. Built analytics projects across stock-market prediction, sales analysis, NLP text processing, and automated job scraping.</w:t>
+        <w:t>Entry-level Data Analyst and BCA Data Science student skilled in Python, SQL, Excel, Power BI, machine learning, dashboarding, data cleaning, and business insight generation. Built analytics projects across stock-market prediction, sales analysis, NLP sentiment analysis, and classification modeling.</w:t>
       </w:r>
     </w:p>
     <w:p>
@@ -130,14 +130,14 @@
           <w:b/>
           <w:sz w:val="16"/>
         </w:rPr>
-        <w:t xml:space="preserve">Automation and Tools: </w:t>
+        <w:t xml:space="preserve">Tools and Platforms: </w:t>
       </w:r>
       <w:r>
         <w:rPr>
           <w:rFonts w:ascii="Arial" w:hAnsi="Arial"/>
           <w:sz w:val="16"/>
         </w:rPr>
-        <w:t>Git, GitHub, web scraping, Requests, BeautifulSoup, SMTP automation, YFinance</w:t>
+        <w:t>Git, GitHub, Streamlit, Google Colab, Kaggle datasets, YouTube Data API, YFinance</w:t>
       </w:r>
     </w:p>
     <w:p>
@@ -426,7 +426,7 @@
           <w:b/>
           <w:sz w:val="17"/>
         </w:rPr>
-        <w:t>NLP and Chatbot Projects | Python, NLTK, TF-IDF, Word2Vec, LDA</w:t>
+        <w:t>NLP Sentiment Analysis | Python, NLTK, TF-IDF, TextBlob, Naive Bayes, SVM, LSTM</w:t>
       </w:r>
     </w:p>
     <w:p>
@@ -439,7 +439,7 @@
           <w:rFonts w:ascii="Arial" w:hAnsi="Arial"/>
           <w:sz w:val="16"/>
         </w:rPr>
-        <w:t>Built rule-based chatbot workflows with NLTK reflections, regex response pairs, conversation logging, and timestamp capture.</w:t>
+        <w:t>Built IMDB movie-review sentiment analysis workflow using Kaggle's 50,000-review dataset, regex cleaning, stopword removal, TF-IDF vectorization, train-test split, Logistic Regression, and Multinomial Naive Bayes.</w:t>
       </w:r>
     </w:p>
     <w:p>
@@ -452,7 +452,20 @@
           <w:rFonts w:ascii="Arial" w:hAnsi="Arial"/>
           <w:sz w:val="16"/>
         </w:rPr>
-        <w:t>Implemented text cleaning, tokenization, stopword removal, TF-IDF vectors, cosine similarity, Word2Vec document vectors, and topic modeling with LDA.</w:t>
+        <w:t>Analyzed YouTube comments by fetching up to 100 comments through the YouTube Data API, labeling sentiment with TextBlob, and comparing TF-IDF Naive Bayes/SVM models with an LSTM deep-learning model.</w:t>
+      </w:r>
+    </w:p>
+    <w:p>
+      <w:pPr>
+        <w:pStyle w:val="ListBullet"/>
+        <w:spacing w:before="0" w:after="20" w:line="245" w:lineRule="auto"/>
+      </w:pPr>
+      <w:r>
+        <w:rPr>
+          <w:rFonts w:ascii="Arial" w:hAnsi="Arial"/>
+          <w:sz w:val="16"/>
+        </w:rPr>
+        <w:t>Generated sentiment distributions, classification reports, confusion matrices, and custom review prediction functions for positive, neutral, and negative sentiment classes.</w:t>
       </w:r>
     </w:p>
     <w:p>
@@ -465,7 +478,7 @@
           <w:b/>
           <w:sz w:val="17"/>
         </w:rPr>
-        <w:t>Job Scraper Automation | Python, Requests, BeautifulSoup, SMTP</w:t>
+        <w:t>Titanic Survival Prediction | Python, Pandas, Seaborn, Scikit-learn, XGBoost, LightGBM</w:t>
       </w:r>
     </w:p>
     <w:p>
@@ -478,7 +491,33 @@
           <w:rFonts w:ascii="Arial" w:hAnsi="Arial"/>
           <w:sz w:val="16"/>
         </w:rPr>
-        <w:t>Created a Python automation script to scrape entry-level data analyst job titles from Indeed and send collected results by email.</w:t>
+        <w:t>Performed EDA on passenger demographics, fare, class, family counts, embarkation, and survival outcomes using histograms, bar plots, pivot tables, and correlation heatmaps.</w:t>
+      </w:r>
+    </w:p>
+    <w:p>
+      <w:pPr>
+        <w:pStyle w:val="ListBullet"/>
+        <w:spacing w:before="0" w:after="20" w:line="245" w:lineRule="auto"/>
+      </w:pPr>
+      <w:r>
+        <w:rPr>
+          <w:rFonts w:ascii="Arial" w:hAnsi="Arial"/>
+          <w:sz w:val="16"/>
+        </w:rPr>
+        <w:t>Cleaned missing values, dropped high-cardinality fields, log-transformed Fare, label-encoded categorical variables, and built train-test preprocessing for Kaggle-style submission output.</w:t>
+      </w:r>
+    </w:p>
+    <w:p>
+      <w:pPr>
+        <w:pStyle w:val="ListBullet"/>
+        <w:spacing w:before="0" w:after="20" w:line="245" w:lineRule="auto"/>
+      </w:pPr>
+      <w:r>
+        <w:rPr>
+          <w:rFonts w:ascii="Arial" w:hAnsi="Arial"/>
+          <w:sz w:val="16"/>
+        </w:rPr>
+        <w:t>Compared Decision Tree, LightGBM, XGBoost, Random Forest, Extra Trees, and Logistic Regression with train-test accuracy and 5-fold cross-validation; documented final model accuracy of 73.8%.</w:t>
       </w:r>
     </w:p>
     <w:p>
@@ -641,7 +680,7 @@
           <w:rFonts w:ascii="Arial" w:hAnsi="Arial"/>
           <w:sz w:val="16"/>
         </w:rPr>
-        <w:t>Titanic survival prediction, time-series analysis, R programming practice, HTML/CSS product website, and Excel customer/order/product dataset analysis.</w:t>
+        <w:t>Time-series analysis, R programming practice, HTML/CSS product website, and Excel customer/order/product dataset analysis.</w:t>
       </w:r>
     </w:p>
     <w:sectPr>

</xml_diff>